<commit_message>
Motivo da saída, foto e assinatura ficam só com o RH
POP-02 v1.1: a TI recebe só a data e hora do bloqueio, sem o motivo. Formulário A sem o tipo de saída; Formulário C sem a autorização de foto. Padrão de e-mail v1.1: a TI só recebe e instala a imagem de rodapé. Impressão regerada.

Co-Authored-By: Claude Opus 5.5 <noreply@anthropic.com>
</commit_message>
<xml_diff>
--- a/impressao/POP-01-entrada.docx
+++ b/impressao/POP-01-entrada.docx
@@ -1053,16 +1053,16 @@
           <w:b/>
           <w:bCs/>
         </w:rPr>
-        <w:t xml:space="preserve">Foto:</w:t>
-      </w:r>
-      <w:r>
-        <w:t xml:space="preserve"> pedir ao funcionário a foto no padrão de </w:t>
+        <w:t xml:space="preserve">Foto e imagem de rodapé</w:t>
+      </w:r>
+      <w:r>
+        <w:t xml:space="preserve"> (perfis B, C e D): o RH providencia, pelas regras do próprio RH, e anexa as duas ao chamado para a TI (</w:t>
       </w:r>
       <w:r>
         <w:t xml:space="preserve">anexos/padrao-email.md</w:t>
       </w:r>
       <w:r>
-        <w:t xml:space="preserve"> §4 (ou tirar na admissão). O RH edita, monta a imagem de rodapé e anexa as duas ao chamado para a TI.</w:t>
+        <w:t xml:space="preserve"> §3).</w:t>
       </w:r>
     </w:p>
     <w:p>

</xml_diff>